<commit_message>
docs: annotate Word2Vec implementation in Chinese
</commit_message>
<xml_diff>
--- a/基础/代码/Word2Vec源码练习册.docx
+++ b/基础/代码/Word2Vec源码练习册.docx
@@ -21,6 +21,11 @@
     <w:p>
       <w:r>
         <w:t>从“读不懂代码”到“能够追踪一次训练更新”</w:t>
+      </w:r>
+    </w:p>
+    <w:p>
+      <w:r>
+        <w:t>定位说明：本练习册行号对应上游未注释版本。当前word2vec.c已增加中文注释，请按函数名定位；题目与答案仍适用。</w:t>
       </w:r>
     </w:p>
     <w:p>

</xml_diff>